<commit_message>
fix(site): production audit corrections for CVs, labels and OpsFlow copy
CVs (docx + pdf, regenerated, still 2 pages each):
- Use current positioning: Port & Logistics Operations Specialist
- Job title matches the site (Senior Outdoor Assistant, Revenue Branch,
  Traffic Department)
- Remove claims without project evidence: MongoDB, Stripe, NextAuth, JWT,
  TanStack, "overtime payroll", "hours to minutes", "IT Systems"
- Skills list now mirrors the capabilities page

Site:
- Rename "AI Engineering" label to "AI-Assisted Development"
- Number hero capability list 01-02 (was 02-03)
- Remove the defensive "no customers, no revenue" line from the OpsFlow
  homepage section and product page; status stays clear through the
  In development badge and Implemented / In development / Planned list
- Bump service worker cache to v85

Co-Authored-By: Claude Sonnet 5.5 <noreply@anthropic.com>
</commit_message>
<xml_diff>
--- a/MD-Samiul-Alam-Sumel-CV.docx
+++ b/MD-Samiul-Alam-Sumel-CV.docx
@@ -27,7 +27,7 @@
           <w:color w:val="B8862A"/>
           <w:sz w:val="23"/>
         </w:rPr>
-        <w:t>Product Engineer for Real-World Operations</w:t>
+        <w:t>Port &amp; Logistics Operations Specialist</w:t>
       </w:r>
     </w:p>
     <w:p>
@@ -155,7 +155,7 @@
           <w:color w:val="2A2A2A"/>
           <w:sz w:val="18"/>
         </w:rPr>
-        <w:t>Product Engineer for Real-World Operations — turns operational problems into practical software. 12+ years of hands-on experience in cargo billing, vessel/vehicle tracking, and port authority workflows at Mongla Port Authority. Works requirement-first — finds the manual step in a process, designs the system, and builds it with AI-assisted development, tested against real business rules before it ships. 3 self-built tools are in daily production use at the billing desk and Traffic Department. Skills backed by that shipped software and self-directed study (The Odin Project, Full Stack Open), not a bootcamp certificate. Builds frontend independently; backend/data work with AI-assisted development (Claude Code), going deeper through a self-authored engineering roadmap. Not a bootcamp graduate or senior engineer, but bringing 12+ years of professional discipline from a demanding operational job. Seeking a remote Product Engineer, Port Operations Technologist, Logistics Systems Engineer, or full-stack role, worldwide, with no time zone constraints.</w:t>
+        <w:t>Port &amp; Logistics Operations Specialist with 12+ years of hands-on experience in cargo billing, vehicle and cargo tracking, revenue reporting and operational workflows at Mongla Port Authority (Traffic Department). Turns repetitive manual and Excel processes into working business systems: three self-built web tools are used at the billing desk and in the Traffic Department. Builds with AI-assisted development (Claude Code); requirements, business rules, testing and validation stay with me. Self-directed learning through The Odin Project and Full Stack Open. Open to international and remote roles in port and logistics operations technology, business systems and automation, or product / full-stack development.</w:t>
       </w:r>
     </w:p>
     <w:p>
@@ -192,7 +192,7 @@
           <w:color w:val="2A2A2A"/>
           <w:sz w:val="19"/>
         </w:rPr>
-        <w:t>Port billing &amp; tariff systems, wharfrent/VAT/levy calculation, cargo &amp; vessel tracking, C&amp;F agent workflows, customs/regulatory compliance context</w:t>
+        <w:t>Port billing, wharf-rent / VAT / levy calculation, cargo and vehicle tracking, container tallying and statistics, C&amp;F agent workflows, customs-related reporting</w:t>
       </w:r>
     </w:p>
     <w:p>
@@ -213,7 +213,7 @@
           <w:color w:val="2A2A2A"/>
           <w:sz w:val="19"/>
         </w:rPr>
-        <w:t>HTML5 (Semantic), CSS3, Responsive Design, Tailwind CSS, DaisyUI, JavaScript (ES6+), DOM &amp; Events, Fetch &amp; Promises / Async-Await, Array/Object Methods, ES Modules</w:t>
+        <w:t>HTML5 (semantic), CSS3, responsive design, JavaScript (ES6+), PWA / offline-first, Chart.js, Tailwind CSS</w:t>
       </w:r>
     </w:p>
     <w:p>
@@ -227,14 +227,14 @@
           <w:color w:val="1E3A5F"/>
           <w:sz w:val="19"/>
         </w:rPr>
-        <w:t xml:space="preserve">React &amp; Next.js:  </w:t>
+        <w:t xml:space="preserve">Building with (OpsFlow, in development):  </w:t>
       </w:r>
       <w:r>
         <w:rPr>
           <w:color w:val="2A2A2A"/>
           <w:sz w:val="19"/>
         </w:rPr>
-        <w:t>Own: React (Hooks, Context), React Router, React Hook Form. AI-assisted: TanStack Query, Axios (incl. Interceptors), Next.js App Router, NextAuth</w:t>
+        <w:t>TypeScript, React, Vite, Hono, Zod, Cloudflare Workers + D1 (SQL), Vitest, GitHub Actions</w:t>
       </w:r>
     </w:p>
     <w:p>
@@ -248,14 +248,14 @@
           <w:color w:val="1E3A5F"/>
           <w:sz w:val="19"/>
         </w:rPr>
-        <w:t xml:space="preserve">Backend, Data &amp; Deployment:  </w:t>
+        <w:t xml:space="preserve">Deployment &amp; Tooling:  </w:t>
       </w:r>
       <w:r>
         <w:rPr>
           <w:color w:val="2A2A2A"/>
           <w:sz w:val="19"/>
         </w:rPr>
-        <w:t>Own: Git &amp; GitHub (Branching, PRs), deployment (Cloudflare Pages/Firebase/Netlify). AI-assisted: Node.js &amp; Express, REST APIs (CRUD), MongoDB (Atlas), Aggregation Pipeline, JWT Auth, Firebase Auth &amp; Admin SDK, Next.js API Routes, Stripe Payments, Pagination &amp; Search</w:t>
+        <w:t>Cloudflare Pages / Workers, Firebase Auth / Firestore, Git &amp; GitHub (branching, PRs), Node.js test runner, Claude Code (AI-assisted development). Learning: Node.js / Express depth</w:t>
       </w:r>
     </w:p>
     <w:p>
@@ -276,7 +276,7 @@
           <w:color w:val="2A2A2A"/>
           <w:sz w:val="19"/>
         </w:rPr>
-        <w:t>Bash Scripting, Linux Administration (Ubuntu), systemd, Cron &amp; Timers, Monitoring &amp; Alerting Scripts</w:t>
+        <w:t>Daily Ubuntu use; Bash scripting practice (public repos on GitHub)</w:t>
       </w:r>
     </w:p>
     <w:p>
@@ -308,7 +308,7 @@
           <w:color w:val="1E3A5F"/>
           <w:sz w:val="20"/>
         </w:rPr>
-        <w:t>Senior Outdoor Assistant — Port Operations &amp; IT Systems</w:t>
+        <w:t>Senior Outdoor Assistant (Revenue Branch) — Traffic Department</w:t>
       </w:r>
       <w:r>
         <w:rPr>
@@ -366,7 +366,7 @@
           <w:color w:val="2A2A2A"/>
           <w:sz w:val="18"/>
         </w:rPr>
-        <w:t>Manage end-to-end wharfrent billing cycle — slab-wise charge computation, VAT and levy calculation, inside/outside cargo split, and final billing issuance for active C&amp;F agents; identified the recurring manual-calculation bottleneck and independently built and deployed portbill, now used daily by the billing desk.</w:t>
+        <w:t>Work through the wharfrent billing cycle — slab-wise charge computation, VAT and levy calculation, inside/outside cargo split, and final billing for active C&amp;F agents; identified the recurring manual-calculation bottleneck and independently built and deployed portbill, now used daily by the billing desk.</w:t>
       </w:r>
     </w:p>
     <w:p>
@@ -381,7 +381,7 @@
           <w:color w:val="2A2A2A"/>
           <w:sz w:val="18"/>
         </w:rPr>
-        <w:t>Track cargo and vehicle positions across warehouse, shed, and yard terminal locations in real time; the single-person, Excel-only version of this record was the direct trigger for building carview, now the Traffic Department's shared, version-controlled tracking system.</w:t>
+        <w:t>Track cargo and vehicle positions across warehouse, shed, and yard terminal locations daily; the single-person, Excel-only version of this record was the direct trigger for building carview, now the Traffic Department's shared, version-controlled tracking system.</w:t>
       </w:r>
     </w:p>
     <w:p>
@@ -615,7 +615,7 @@
           <w:color w:val="2A2A2A"/>
           <w:sz w:val="18"/>
         </w:rPr>
-        <w:t>Real-time advance wharfrent calculator: slab-based charge computation, VAT and levy calculation, inside/outside cargo split, hoisting charge auto-calculation, print-ready A4 output. Actively used by C&amp;F agents at Mongla Port daily.</w:t>
+        <w:t>Real-time advance wharfrent calculator: slab-based charge computation, VAT and levy calculation, inside/outside cargo split, hoisting charge auto-calculation, print-ready A4 output. Used at the billing counter to check charges before final submission.</w:t>
       </w:r>
     </w:p>
     <w:p>
@@ -761,7 +761,7 @@
           <w:color w:val="2A2A2A"/>
           <w:sz w:val="18"/>
         </w:rPr>
-        <w:t>Staff enters an employee profile once; the system generates the complete final OT bill instantly with correct hourly rate, cumulative date-wise OT calculation, and A4 print-ready output. Reduced billing cycle time from hours to minutes.</w:t>
+        <w:t>Staff enters an employee profile once; the system generates the complete final OT bill instantly with correct hourly rate, cumulative date-wise OT calculation, and A4 print-ready output.</w:t>
       </w:r>
     </w:p>
     <w:p>

</xml_diff>

<commit_message>
feat(site): reposition as Business Process Automation, port as origin
Co-Authored-By: Claude Sonnet 5.5 <noreply@anthropic.com>
</commit_message>
<xml_diff>
--- a/MD-Samiul-Alam-Sumel-CV.docx
+++ b/MD-Samiul-Alam-Sumel-CV.docx
@@ -27,7 +27,7 @@
           <w:color w:val="B8862A"/>
           <w:sz w:val="23"/>
         </w:rPr>
-        <w:t>Port &amp; Logistics Operations Specialist</w:t>
+        <w:t>Business Process Automation Specialist</w:t>
       </w:r>
     </w:p>
     <w:p>
@@ -155,7 +155,7 @@
           <w:color w:val="2A2A2A"/>
           <w:sz w:val="18"/>
         </w:rPr>
-        <w:t>Port &amp; Logistics Operations Specialist with 12+ years of hands-on experience in cargo billing, vehicle and cargo tracking, revenue reporting and operational workflows at Mongla Port Authority (Traffic Department). Turns repetitive manual and Excel processes into working business systems: three self-built web tools are used at the billing desk and in the Traffic Department. Builds with AI-assisted development (Claude Code); requirements, business rules, testing and validation stay with me. Self-directed learning through The Odin Project and Full Stack Open. Open to international and remote roles in port and logistics operations technology, business systems and automation, or product / full-stack development.</w:t>
+        <w:t>Business Process Automation Specialist with 12+ years of hands-on experience in cargo billing, vehicle and cargo tracking, revenue reporting and operational workflows at Mongla Port Authority (Traffic Department). Turns repetitive manual and Excel processes into working business systems: three self-built web tools are used at the billing desk and in the Traffic Department. Builds with AI-assisted development (Claude Code); requirements, business rules, testing and validation stay with me. Self-directed learning through The Odin Project and Full Stack Open. Open to international and remote roles in business process automation, internal tools and web systems, operations technology, or product development.</w:t>
       </w:r>
     </w:p>
     <w:p>

</xml_diff>

<commit_message>
docs(cv): rebuild both CVs from the current site content
Regenerate the Global Operations & Systems CV and the Product Building
CV (DOCX and PDF, two pages each) so they match the live portfolio.

- Skills follow the /capabilities/ tiers (proven, working knowledge,
  currently developing, self-directed practice); Linux and Bash appear
  only as practice.
- Port Billing, CarView and OT Bill use the published problem and
  solution wording; figures are kept only where a case study states
  them.
- Add OpsFlow (in development, early build, no customer claim) and
  Anchora Commerce (source only).
- Experience lists the confirmed operational areas; correct the claim
  that agents use the tools directly (port staff do).
- Product CV: services aligned with the site, Mongla (UTC+6) location
  and flexible hours.
- Document the rebuild rules in CLAUDE.md.

Co-Authored-By: Claude Sonnet 5.5 <noreply@anthropic.com>
</commit_message>
<xml_diff>
--- a/MD-Samiul-Alam-Sumel-CV.docx
+++ b/MD-Samiul-Alam-Sumel-CV.docx
@@ -155,7 +155,7 @@
           <w:color w:val="2A2A2A"/>
           <w:sz w:val="18"/>
         </w:rPr>
-        <w:t>Web developer specialising in business process automation, with 12+ years of hands-on experience in cargo billing, vehicle and cargo tracking, revenue reporting and operational workflows at Mongla Port Authority (Traffic Department). Turns repetitive manual and Excel processes into working business systems: three self-built web tools are used at the billing desk and in the Traffic Department. Builds with AI-assisted development (Claude Code); requirements, business rules, testing and validation stay with me. Self-directed learning through The Odin Project and Full Stack Open. Open to international and remote roles in business process automation, internal tools and web systems, operations technology, or product development.</w:t>
+        <w:t>Web developer who builds business systems and internal tools, with 12+ years of hands-on experience in cargo billing, vehicle and cargo tracking, revenue reporting and operational workflows at Mongla Port Authority (Traffic Department). Replaces manual and Excel processes with working web systems: three self-built tools (Port Billing, CarView and OT Bill) are in daily use at the billing desk and in the Traffic Department. Builds with AI-assisted development (Claude Code); requirements, business rules, testing and validation stay with me. Open to international and remote roles in web development for business systems and internal tools, process automation, operations technology or product building.</w:t>
       </w:r>
     </w:p>
     <w:p>
@@ -192,7 +192,7 @@
           <w:color w:val="2A2A2A"/>
           <w:sz w:val="19"/>
         </w:rPr>
-        <w:t>Port billing, wharf-rent / VAT / levy calculation, cargo and vehicle tracking, container tallying and statistics, C&amp;F agent workflows, customs-related reporting</w:t>
+        <w:t>Port billing, wharf-rent / VAT / levy calculation, advance billing estimates, cargo and vehicle tracking, container tallying and statistics, revenue reporting, C&amp;F agent workflows, customs-related reporting</w:t>
       </w:r>
     </w:p>
     <w:p>
@@ -206,14 +206,14 @@
           <w:color w:val="1E3A5F"/>
           <w:sz w:val="19"/>
         </w:rPr>
-        <w:t xml:space="preserve">Frontend &amp; JavaScript:  </w:t>
+        <w:t xml:space="preserve">Proven in live projects:  </w:t>
       </w:r>
       <w:r>
         <w:rPr>
           <w:color w:val="2A2A2A"/>
           <w:sz w:val="19"/>
         </w:rPr>
-        <w:t>HTML5 (semantic), CSS3, responsive design, JavaScript (ES6+), PWA / offline-first, Chart.js, Tailwind CSS</w:t>
+        <w:t>HTML5, CSS3, JavaScript (ES6+), PWA / offline-first, Cloudflare Pages &amp; Workers, Firebase Auth &amp; Firestore, Chart.js &amp; Excel export, automated tests, Git &amp; GitHub, React &amp; Next.js, AI-assisted development (Claude Code)</w:t>
       </w:r>
     </w:p>
     <w:p>
@@ -227,14 +227,14 @@
           <w:color w:val="1E3A5F"/>
           <w:sz w:val="19"/>
         </w:rPr>
-        <w:t xml:space="preserve">Building with (OpsFlow, in development):  </w:t>
+        <w:t xml:space="preserve">Working knowledge:  </w:t>
       </w:r>
       <w:r>
         <w:rPr>
           <w:color w:val="2A2A2A"/>
           <w:sz w:val="19"/>
         </w:rPr>
-        <w:t>TypeScript, React, Vite, Hono, Zod, Cloudflare Workers + D1 (SQL), Vitest, GitHub Actions</w:t>
+        <w:t>TypeScript, Tailwind CSS &amp; Vite, Hono &amp; Zod APIs, SQL on Cloudflare D1, database design, Vitest &amp; CI/CD (used in OpsFlow, in development)</w:t>
       </w:r>
     </w:p>
     <w:p>
@@ -248,14 +248,14 @@
           <w:color w:val="1E3A5F"/>
           <w:sz w:val="19"/>
         </w:rPr>
-        <w:t xml:space="preserve">Deployment &amp; Tooling:  </w:t>
+        <w:t xml:space="preserve">Currently developing:  </w:t>
       </w:r>
       <w:r>
         <w:rPr>
           <w:color w:val="2A2A2A"/>
           <w:sz w:val="19"/>
         </w:rPr>
-        <w:t>Cloudflare Pages / Workers, Firebase Auth / Firestore, Git &amp; GitHub (branching, PRs), Node.js test runner, Claude Code (AI-assisted development). Learning: Node.js / Express depth</w:t>
+        <w:t>Node.js &amp; Express depth, automated testing depth, TypeScript depth</w:t>
       </w:r>
     </w:p>
     <w:p>
@@ -269,14 +269,14 @@
           <w:color w:val="1E3A5F"/>
           <w:sz w:val="19"/>
         </w:rPr>
-        <w:t xml:space="preserve">Linux &amp; Automation (self-directed):  </w:t>
+        <w:t xml:space="preserve">Self-directed practice:  </w:t>
       </w:r>
       <w:r>
         <w:rPr>
           <w:color w:val="2A2A2A"/>
           <w:sz w:val="19"/>
         </w:rPr>
-        <w:t>Daily Ubuntu use; Bash scripting practice (public repos on GitHub)</w:t>
+        <w:t>Linux / Ubuntu, Bash scripting, systemd &amp; cron / timers, monitoring scripts (public repos on GitHub)</w:t>
       </w:r>
     </w:p>
     <w:p>
@@ -366,7 +366,7 @@
           <w:color w:val="2A2A2A"/>
           <w:sz w:val="18"/>
         </w:rPr>
-        <w:t>Work through the wharfrent billing cycle — slab-wise charge computation, VAT and levy calculation, inside/outside cargo split, and final billing for active C&amp;F agents; identified the recurring manual-calculation bottleneck and independently built and deployed portbill, now used daily by the billing desk.</w:t>
+        <w:t>Billing: wharf-rent billing (slab-wise charges, VAT and levy, inside/outside cargo split), vehicle, general-cargo and stuffing, delivery and shipping-related billing, demurrage, advance billing estimates and billing records, applying the port's published tariff.</w:t>
       </w:r>
     </w:p>
     <w:p>
@@ -381,7 +381,7 @@
           <w:color w:val="2A2A2A"/>
           <w:sz w:val="18"/>
         </w:rPr>
-        <w:t>Track cargo and vehicle positions across warehouse, shed, and yard terminal locations daily; the single-person, Excel-only version of this record was the direct trigger for building carview, now the Traffic Department's shared, version-controlled tracking system.</w:t>
+        <w:t>Reporting: daily and monthly revenue reports, cumulative income statements and monthly Traffic Department reporting for port authority management; container, cargo, vehicle and jetty statistics; Excel-based data preparation and record checking.</w:t>
       </w:r>
     </w:p>
     <w:p>
@@ -396,20 +396,7 @@
           <w:color w:val="2A2A2A"/>
           <w:sz w:val="18"/>
         </w:rPr>
-        <w:t>Operate the port automation billing system end-to-end and coordinate C&amp;F agent documentation and advance payment planning.</w:t>
-      </w:r>
-    </w:p>
-    <w:p>
-      <w:pPr>
-        <w:spacing w:after="20" w:line="252" w:lineRule="auto"/>
-      </w:pPr>
-      <w:r>
-        <w:rPr>
-          <w:i/>
-          <w:color w:val="B8862A"/>
-          <w:sz w:val="18"/>
-        </w:rPr>
-        <w:t>Self-Initiated Web Development &amp; Learning</w:t>
+        <w:t>Operations records: container tallying, vehicle delivery and position tracking across warehouse, shed and yard, customs-related vehicle (auction) reporting, and the bank-deposit (challan) workflow with monthly statements.</w:t>
       </w:r>
     </w:p>
     <w:p>
@@ -424,7 +411,20 @@
           <w:color w:val="2A2A2A"/>
           <w:sz w:val="18"/>
         </w:rPr>
-        <w:t>Talked to the billing desk, Traffic Department, and C&amp;F agents to find the manual bottleneck in each workflow — then designed and deployed 3 live web applications now used daily by C&amp;F agents and port staff, built with plain JavaScript/HTML/CSS and AI-assisted development as a productivity tool.</w:t>
+        <w:t>Coordination: C&amp;F agents (paperwork, billing queries, advance payment planning), shipping agents and stevedoring stakeholders.</w:t>
+      </w:r>
+    </w:p>
+    <w:p>
+      <w:pPr>
+        <w:spacing w:after="20" w:line="252" w:lineRule="auto"/>
+      </w:pPr>
+      <w:r>
+        <w:rPr>
+          <w:i/>
+          <w:color w:val="B8862A"/>
+          <w:sz w:val="18"/>
+        </w:rPr>
+        <w:t>From manual work to software</w:t>
       </w:r>
     </w:p>
     <w:p>
@@ -439,7 +439,7 @@
           <w:color w:val="2A2A2A"/>
           <w:sz w:val="18"/>
         </w:rPr>
-        <w:t>Worked through a large part of a full-stack curriculum (HTML/CSS, JavaScript, React, part of Node.js/Express and Next.js) alongside a full-time port operations career, before stepping away to focus on shipping real projects.</w:t>
+        <w:t>Moved from manual work to Excel automation, then to internal tools, web apps and business systems: Port Billing System, CarView and OT Bill Automation, each built around the real workflow after talking to the people who use it, and each in daily use.</w:t>
       </w:r>
     </w:p>
     <w:p>
@@ -454,7 +454,22 @@
           <w:color w:val="2A2A2A"/>
           <w:sz w:val="18"/>
         </w:rPr>
-        <w:t>Maintain an active public GitHub portfolio (github.com/samiulAsumel) demonstrating continuous technical growth.</w:t>
+        <w:t>Builds with AI-assisted development as a productivity tool; the requirements, business rules, review and testing stay with me.</w:t>
+      </w:r>
+    </w:p>
+    <w:p>
+      <w:pPr>
+        <w:pStyle w:val="ListBullet"/>
+        <w:spacing w:after="20" w:before="0" w:line="240" w:lineRule="auto"/>
+        <w:ind w:left="259"/>
+        <w:jc w:val="both"/>
+      </w:pPr>
+      <w:r>
+        <w:rPr>
+          <w:color w:val="2A2A2A"/>
+          <w:sz w:val="18"/>
+        </w:rPr>
+        <w:t>Maintains an active public GitHub portfolio (github.com/samiulAsumel) and a self-directed practice in Linux and Bash.</w:t>
       </w:r>
     </w:p>
     <w:p>
@@ -551,7 +566,7 @@
           <w:color w:val="1E3A5F"/>
           <w:sz w:val="20"/>
         </w:rPr>
-        <w:t>Port Billing Calculator</w:t>
+        <w:t>Port Billing System</w:t>
       </w:r>
       <w:r>
         <w:rPr>
@@ -601,7 +616,7 @@
           <w:color w:val="5A5A5A"/>
           <w:sz w:val="18"/>
         </w:rPr>
-        <w:t>Problem: Port billing system creates permanent entries — C&amp;F agents had no way to estimate wharfrent charges before committing, causing billing disputes, excessive dwell time, and repeated counter visits.</w:t>
+        <w:t>Problem: C&amp;F agents, importers and shipping agents kept asking what a bill would be. The port's billing system makes permanent entries, so they could not check wharf rent before committing, and revenue staff worked each estimate out by hand or in Excel, causing billing disputes, longer cargo dwell time and repeat counter visits.</w:t>
       </w:r>
     </w:p>
     <w:p>
@@ -615,7 +630,7 @@
           <w:color w:val="2A2A2A"/>
           <w:sz w:val="18"/>
         </w:rPr>
-        <w:t>Real-time advance wharfrent calculator: slab-based charge computation, VAT and levy calculation, inside/outside cargo split, hoisting charge auto-calculation, print-ready A4 output. Used at the billing counter to check charges before final submission.</w:t>
+        <w:t>Advance bill calculator that applies the port's rules in a fixed order: slab-based wharf rent, river dues, landing, removal, weighment and hoisting added to the base, VAT on the base, then levy; inside/outside storage totalled separately. Saved bills with search, a dashboard and a print-ready A4 invoice. The rules run in the browser, so estimates work offline; slab, VAT and rounding rules are covered by automated tests and were compared against real bills. Used daily at the billing counter.</w:t>
       </w:r>
     </w:p>
     <w:p>
@@ -629,7 +644,7 @@
           <w:color w:val="5A5A5A"/>
           <w:sz w:val="17"/>
         </w:rPr>
-        <w:t>Tech: JavaScript, HTML/CSS, Cloudflare Pages, PWA, Print Output</w:t>
+        <w:t>Tech: JavaScript, HTML/CSS, Cloudflare Pages &amp; Worker, PWA, Automated Tests, A4 Print</w:t>
       </w:r>
     </w:p>
     <w:p>
@@ -642,7 +657,7 @@
           <w:color w:val="1E3A5F"/>
           <w:sz w:val="20"/>
         </w:rPr>
-        <w:t>Daily Car Balance &amp; Location Tracking System ("carview")</w:t>
+        <w:t>Vehicle Tracking / CarView</w:t>
       </w:r>
       <w:r>
         <w:rPr>
@@ -674,7 +689,7 @@
           <w:color w:val="5A5A5A"/>
           <w:sz w:val="18"/>
         </w:rPr>
-        <w:t>Problem: Vehicle positions across warehouse, shed, and yard were recorded in one person's personal Excel file — invisible to all other staff, creating bottlenecks and dependency on a single individual.</w:t>
+        <w:t>Problem: Vehicle positions across warehouse, shed and yard were recorded in one person's Excel file, invisible to everyone else. When that person was unavailable, the whole team lost visibility.</w:t>
       </w:r>
     </w:p>
     <w:p>
@@ -688,7 +703,7 @@
           <w:color w:val="2A2A2A"/>
           <w:sz w:val="18"/>
         </w:rPr>
-        <w:t>Offline-first PWA tracking 8 port locations, with Cloudflare Worker + private GitHub repo sync, a Chart.js analytics dashboard (7 charts + KPIs), 13 report sections, and Excel export. Built for Mongla Port Authority's Traffic Department.</w:t>
+        <w:t>Offline-first installable web app tracking eight storage locations, with daily receipts, deliveries, transfers and running balances; a Cloudflare Worker writes to a private GitHub repo so every save is a version-controlled commit. Seven charts, thirteen report sections and Excel export. Built for the Traffic Department and used daily. It records quantities and movements; it is not GPS tracking.</w:t>
       </w:r>
     </w:p>
     <w:p>
@@ -702,7 +717,7 @@
           <w:color w:val="5A5A5A"/>
           <w:sz w:val="17"/>
         </w:rPr>
-        <w:t>Tech: PWA, Cloudflare Worker, Chart.js, GitHub Sync, Excel Export</w:t>
+        <w:t>Tech: PWA, Cloudflare Worker, Chart.js, GitHub-backed data, Excel Export</w:t>
       </w:r>
     </w:p>
     <w:p>
@@ -715,7 +730,7 @@
           <w:color w:val="1E3A5F"/>
           <w:sz w:val="20"/>
         </w:rPr>
-        <w:t>OT Bill Management System</w:t>
+        <w:t>OT Bill Management / Automation</w:t>
       </w:r>
       <w:r>
         <w:rPr>
@@ -747,7 +762,7 @@
           <w:color w:val="5A5A5A"/>
           <w:sz w:val="18"/>
         </w:rPr>
-        <w:t>Problem: Overtime billing was a fully manual Excel process — multi-step hourly rate calculations and final bill generation done by hand every cycle.</w:t>
+        <w:t>Problem: Overtime billing was a repetitive manual calculation: find the employee's pay, work out an hourly rate, add up the hours day by day, then produce the bill in the required format. Errors were easy to make and hard to spot.</w:t>
       </w:r>
     </w:p>
     <w:p>
@@ -761,7 +776,7 @@
           <w:color w:val="2A2A2A"/>
           <w:sz w:val="18"/>
         </w:rPr>
-        <w:t>Staff enters an employee profile once; the system generates the complete final OT bill instantly with correct hourly rate, cumulative date-wise OT calculation, and A4 print-ready output.</w:t>
+        <w:t>Staff enter an employee profile once; the system prepares the overtime bill from daily hours, applies the rate rule automatically (basic pay divided by 104, rounded up) and prints a bill on A4, with an all-bills view and a dashboard. It is overtime billing, not payroll.</w:t>
       </w:r>
     </w:p>
     <w:p>
@@ -775,7 +790,7 @@
           <w:color w:val="5A5A5A"/>
           <w:sz w:val="17"/>
         </w:rPr>
-        <w:t>Tech: JavaScript, Employee DB, Auto-Calc, A4 Print, Cloudflare Pages</w:t>
+        <w:t>Tech: JavaScript, Employee records, Auto-calculation, A4 Print, Cloudflare Pages</w:t>
       </w:r>
     </w:p>
     <w:p>
@@ -788,7 +803,7 @@
           <w:color w:val="1E3A5F"/>
           <w:sz w:val="20"/>
         </w:rPr>
-        <w:t>Client Intake Form</w:t>
+        <w:t>OpsFlow (in development)</w:t>
       </w:r>
       <w:r>
         <w:rPr>
@@ -805,7 +820,7 @@
             <w:color w:val="B8862A"/>
             <w:sz w:val="17.6"/>
           </w:rPr>
-          <w:t>Live</w:t>
+          <w:t>Early build</w:t>
         </w:r>
       </w:hyperlink>
       <w:r>
@@ -823,7 +838,7 @@
             <w:color w:val="B8862A"/>
             <w:sz w:val="17.6"/>
           </w:rPr>
-          <w:t>GitHub</w:t>
+          <w:t>Case study</w:t>
         </w:r>
       </w:hyperlink>
     </w:p>
@@ -838,7 +853,7 @@
           <w:color w:val="5A5A5A"/>
           <w:sz w:val="18"/>
         </w:rPr>
-        <w:t>Problem: Collecting project requirements from a client over email or chat is unstructured — details get missed, wasting time on both sides.</w:t>
+        <w:t>Problem: Transport and logistics firms run orders, trips, invoices and payments across Excel, WhatsApp and manual records.</w:t>
       </w:r>
     </w:p>
     <w:p>
@@ -852,7 +867,7 @@
           <w:color w:val="2A2A2A"/>
           <w:sz w:val="18"/>
         </w:rPr>
-        <w:t>Project requirement intake form — 18 structured sections, a serverless submission API, and a password-protected admin dashboard that tracks each lead from New to Won/Lost, with the client's own email app as a fallback.</w:t>
+        <w:t>Multi-tenant operations software, built in stages. Implemented: tenant-isolated accounts and roles, customer, route and rate-card data, fleet records and quotations. In development: orders and trips. Planned: invoices, payments, outstanding balances and reports. Private repository; an early build, not a live product.</w:t>
       </w:r>
     </w:p>
     <w:p>
@@ -866,7 +881,7 @@
           <w:color w:val="5A5A5A"/>
           <w:sz w:val="17"/>
         </w:rPr>
-        <w:t>Tech: JavaScript, HTML/CSS, Cloudflare Pages Functions, GitHub API</w:t>
+        <w:t>Tech: TypeScript, React, Vite, Hono, Zod, Cloudflare Workers + D1, Vitest, GitHub Actions</w:t>
       </w:r>
     </w:p>
     <w:p>
@@ -879,7 +894,7 @@
           <w:color w:val="1E3A5F"/>
           <w:sz w:val="20"/>
         </w:rPr>
-        <w:t>SalahSync</w:t>
+        <w:t>Client Intake Form</w:t>
       </w:r>
       <w:r>
         <w:rPr>
@@ -929,7 +944,7 @@
           <w:color w:val="5A5A5A"/>
           <w:sz w:val="18"/>
         </w:rPr>
-        <w:t>Problem: A static printed daily-routine sheet couldn't adapt when Fajr time or office hours shifted, and couldn't track whether a prayer was actually made in jamaah, alone, or missed.</w:t>
+        <w:t>Problem: Collecting project requirements from a client over email or chat is unstructured: details get missed, and without a written scope, what was agreed becomes a dispute later.</w:t>
       </w:r>
     </w:p>
     <w:p>
@@ -943,7 +958,7 @@
           <w:color w:val="2A2A2A"/>
           <w:sz w:val="18"/>
         </w:rPr>
-        <w:t>Offline-first installable PWA: set Fajr time/location and office hours once, and the full day's schedule (Tahajjud through sleep) recalculates itself, with a prayer/amal tracker, streaks, and offline solar prayer-time calculation — no API dependency. Personal daily-use tool, bilingual Bangla/English UI.</w:t>
+        <w:t>Project requirement intake form: 18 structured sections that adapt to the project type, a serverless submission API, and a password-protected admin dashboard that tracks each lead from New to Won/Lost, with the client's own email app as a fallback.</w:t>
       </w:r>
     </w:p>
     <w:p>
@@ -957,7 +972,7 @@
           <w:color w:val="5A5A5A"/>
           <w:sz w:val="17"/>
         </w:rPr>
-        <w:t>Tech: PWA, Offline-First, Vanilla JS, i18n</w:t>
+        <w:t>Tech: JavaScript, HTML/CSS, Cloudflare Pages Functions, GitHub API</w:t>
       </w:r>
     </w:p>
     <w:p>
@@ -970,7 +985,7 @@
           <w:color w:val="1E3A5F"/>
           <w:sz w:val="20"/>
         </w:rPr>
-        <w:t>World Kitchen Atlas</w:t>
+        <w:t>SalahSync</w:t>
       </w:r>
       <w:r>
         <w:rPr>
@@ -1020,7 +1035,7 @@
           <w:color w:val="5A5A5A"/>
           <w:sz w:val="18"/>
         </w:rPr>
-        <w:t>Problem: Most recipe content online skips real culinary history, and asserts uncertain food history as settled fact rather than acknowledging what isn't actually confirmed.</w:t>
+        <w:t>Problem: A printed daily-routine sheet couldn't adapt when Fajr time or office hours shifted, or record whether a prayer was made in jamaah, alone, or missed.</w:t>
       </w:r>
     </w:p>
     <w:p>
@@ -1034,7 +1049,7 @@
           <w:color w:val="2A2A2A"/>
           <w:sz w:val="18"/>
         </w:rPr>
-        <w:t>Next.js static-export culinary encyclopedia on Cloudflare Pages: continent -&gt; country -&gt; dish browsing, client-side search, and a per-dish confidence rating instead of presenting every entry as equally certain. Cloudflare Worker proxies a private GitHub data repo, admin CRUD, and a Durable-Object-backed visit counter. Asia live (7 countries, 295 dishes); other continents planned.</w:t>
+        <w:t>Offline-first installable PWA: set Fajr time and office hours once and the day's schedule recalculates, with a prayer tracker, streaks and offline solar prayer-time calculation (no API). Personal daily-use tool, bilingual UI.</w:t>
       </w:r>
     </w:p>
     <w:p>
@@ -1048,7 +1063,7 @@
           <w:color w:val="5A5A5A"/>
           <w:sz w:val="17"/>
         </w:rPr>
-        <w:t>Tech: Next.js, TypeScript, Cloudflare Worker, Static Export</w:t>
+        <w:t>Tech: PWA, Offline-First, Vanilla JS, i18n</w:t>
       </w:r>
     </w:p>
     <w:p>
@@ -1061,7 +1076,7 @@
           <w:color w:val="1E3A5F"/>
           <w:sz w:val="20"/>
         </w:rPr>
-        <w:t>English Mastery</w:t>
+        <w:t>World Kitchen Atlas</w:t>
       </w:r>
       <w:r>
         <w:rPr>
@@ -1111,7 +1126,7 @@
           <w:color w:val="5A5A5A"/>
           <w:sz w:val="18"/>
         </w:rPr>
-        <w:t>Problem: English-reading material online is usually a loose pile of pages with no level structure, so a learner can't tell where they are or what to read next.</w:t>
+        <w:t>Problem: Most recipe content online is thin, and states uncertain food history as settled fact.</w:t>
       </w:r>
     </w:p>
     <w:p>
@@ -1125,7 +1140,98 @@
           <w:color w:val="2A2A2A"/>
           <w:sz w:val="18"/>
         </w:rPr>
-        <w:t>Content-driven learning platform: 88 reading lessons across 9 skill levels with 87 paired writing tasks and speaking drills. A Node build script validates every Markdown lesson against a schema and generates the whole static site, so adding a lesson is a one-file change. Zero-framework HTML/CSS/vanilla JS output, GitHub Actions CI, auto-deployed to Cloudflare Pages.</w:t>
+        <w:t>Next.js static-export culinary encyclopedia on Cloudflare Pages: continent -&gt; country -&gt; dish browsing, client-side search, and a per-dish confidence rating. A Cloudflare Worker proxies a private GitHub data repo, with admin CRUD and a Durable-Object-backed visit counter. 295 dish pages across 7 Asian countries; other continents planned.</w:t>
+      </w:r>
+    </w:p>
+    <w:p>
+      <w:pPr>
+        <w:spacing w:after="60" w:line="252" w:lineRule="auto"/>
+        <w:jc w:val="both"/>
+      </w:pPr>
+      <w:r>
+        <w:rPr>
+          <w:i/>
+          <w:color w:val="5A5A5A"/>
+          <w:sz w:val="17"/>
+        </w:rPr>
+        <w:t>Tech: Next.js, TypeScript, Cloudflare Worker, Durable Objects, Static Export</w:t>
+      </w:r>
+    </w:p>
+    <w:p>
+      <w:pPr>
+        <w:spacing w:before="80" w:after="20"/>
+      </w:pPr>
+      <w:r>
+        <w:rPr>
+          <w:b/>
+          <w:color w:val="1E3A5F"/>
+          <w:sz w:val="20"/>
+        </w:rPr>
+        <w:t>English Mastery</w:t>
+      </w:r>
+      <w:r>
+        <w:rPr>
+          <w:color w:val="5A5A5A"/>
+          <w:sz w:val="17"/>
+        </w:rPr>
+        <w:t xml:space="preserve">   —   </w:t>
+      </w:r>
+      <w:hyperlink r:id="rId25">
+        <w:r>
+          <w:rPr>
+            <w:rFonts w:ascii="Calibri" w:hAnsi="Calibri"/>
+            <w:u w:val="single"/>
+            <w:color w:val="B8862A"/>
+            <w:sz w:val="17.6"/>
+          </w:rPr>
+          <w:t>Live</w:t>
+        </w:r>
+      </w:hyperlink>
+      <w:r>
+        <w:rPr>
+          <w:color w:val="5A5A5A"/>
+          <w:sz w:val="17"/>
+        </w:rPr>
+        <w:t xml:space="preserve">  |  </w:t>
+      </w:r>
+      <w:hyperlink r:id="rId26">
+        <w:r>
+          <w:rPr>
+            <w:rFonts w:ascii="Calibri" w:hAnsi="Calibri"/>
+            <w:u w:val="single"/>
+            <w:color w:val="B8862A"/>
+            <w:sz w:val="17.6"/>
+          </w:rPr>
+          <w:t>GitHub</w:t>
+        </w:r>
+      </w:hyperlink>
+    </w:p>
+    <w:p>
+      <w:pPr>
+        <w:spacing w:after="20" w:line="252" w:lineRule="auto"/>
+        <w:jc w:val="both"/>
+      </w:pPr>
+      <w:r>
+        <w:rPr>
+          <w:i/>
+          <w:color w:val="5A5A5A"/>
+          <w:sz w:val="18"/>
+        </w:rPr>
+        <w:t>Problem: English-reading material online has no level structure, so a learner can't tell where they are or what to read next.</w:t>
+      </w:r>
+    </w:p>
+    <w:p>
+      <w:pPr>
+        <w:spacing w:after="20" w:line="252" w:lineRule="auto"/>
+        <w:jc w:val="both"/>
+      </w:pPr>
+      <w:r>
+        <w:rPr>
+          <w:i w:val="0"/>
+          <w:color w:val="2A2A2A"/>
+          <w:sz w:val="18"/>
+        </w:rPr>
+        <w:t>Content-driven learning platform: 88 reading lessons across nine skill levels with 87 paired writing tasks and 87 speaking drills. A Node build script validates every Markdown lesson against a schema and generates the static site, so adding a lesson is a one-file change. GitHub Actions CI, auto-deployed to Cloudflare Pages.</w:t>
       </w:r>
     </w:p>
     <w:p>
@@ -1161,7 +1267,7 @@
         </w:rPr>
         <w:t xml:space="preserve">   —   </w:t>
       </w:r>
-      <w:hyperlink r:id="rId25">
+      <w:hyperlink r:id="rId27">
         <w:r>
           <w:rPr>
             <w:rFonts w:ascii="Calibri" w:hAnsi="Calibri"/>
@@ -1179,7 +1285,7 @@
         </w:rPr>
         <w:t xml:space="preserve">  |  </w:t>
       </w:r>
-      <w:hyperlink r:id="rId26">
+      <w:hyperlink r:id="rId28">
         <w:r>
           <w:rPr>
             <w:rFonts w:ascii="Calibri" w:hAnsi="Calibri"/>
@@ -1202,7 +1308,60 @@
           <w:color w:val="2A2A2A"/>
           <w:sz w:val="17"/>
         </w:rPr>
-        <w:t>Single-user AI-drafted cold-outreach tool — Cloudflare Pages + Workers API, D1-backed leads/analytics, Workers AI draft generation across email/LinkedIn/WhatsApp/cover letter; every send stays a manual, deliberate step.</w:t>
+        <w:t>Single-user AI-drafted outreach tool for a hand-picked lead list: Cloudflare Pages + Workers API, D1-backed leads and analytics, Workers AI drafts; every send stays a manual, deliberate step.</w:t>
+      </w:r>
+    </w:p>
+    <w:p>
+      <w:pPr>
+        <w:spacing w:before="20" w:after="0" w:line="240" w:lineRule="auto"/>
+      </w:pPr>
+      <w:r>
+        <w:rPr>
+          <w:b/>
+          <w:color w:val="1E3A5F"/>
+          <w:sz w:val="18"/>
+        </w:rPr>
+        <w:t>Anchora Commerce</w:t>
+      </w:r>
+      <w:r>
+        <w:rPr>
+          <w:i/>
+          <w:color w:val="5A5A5A"/>
+          <w:sz w:val="16"/>
+        </w:rPr>
+        <w:t xml:space="preserve">  (source only, portfolio build, not a live shop)</w:t>
+      </w:r>
+      <w:r>
+        <w:rPr>
+          <w:color w:val="5A5A5A"/>
+          <w:sz w:val="16"/>
+        </w:rPr>
+        <w:t xml:space="preserve">   —   </w:t>
+      </w:r>
+      <w:hyperlink r:id="rId29">
+        <w:r>
+          <w:rPr>
+            <w:rFonts w:ascii="Calibri" w:hAnsi="Calibri"/>
+            <w:u w:val="single"/>
+            <w:color w:val="B8862A"/>
+            <w:sz w:val="16.4"/>
+          </w:rPr>
+          <w:t>GitHub</w:t>
+        </w:r>
+      </w:hyperlink>
+    </w:p>
+    <w:p>
+      <w:pPr>
+        <w:spacing w:after="20" w:line="252" w:lineRule="auto"/>
+        <w:jc w:val="both"/>
+      </w:pPr>
+      <w:r>
+        <w:rPr>
+          <w:i w:val="0"/>
+          <w:color w:val="2A2A2A"/>
+          <w:sz w:val="17"/>
+        </w:rPr>
+        <w:t>Full-stack commerce platform: storefront with cart and checkout (stock validated in a transaction) and a role-gated admin dashboard. Next.js 15, TypeScript, Prisma, PostgreSQL, Docker, Vitest and Playwright tests, GitHub Actions.</w:t>
       </w:r>
     </w:p>
     <w:p>
@@ -1232,7 +1391,7 @@
         </w:rPr>
         <w:t xml:space="preserve">   —   </w:t>
       </w:r>
-      <w:hyperlink r:id="rId27">
+      <w:hyperlink r:id="rId30">
         <w:r>
           <w:rPr>
             <w:rFonts w:ascii="Calibri" w:hAnsi="Calibri"/>
@@ -1255,37 +1414,7 @@
           <w:color w:val="2A2A2A"/>
           <w:sz w:val="17"/>
         </w:rPr>
-        <w:t>Self-hosted personal AI assistant with multi-model routing (Groq, OpenRouter, Claude, Gemini, local Ollama), voice I/O, and persistent memory.</w:t>
-      </w:r>
-    </w:p>
-    <w:p>
-      <w:pPr>
-        <w:spacing w:before="120" w:after="60"/>
-        <w:pBdr>
-          <w:bottom w:val="single" w:sz="6" w:space="2" w:color="B8862A"/>
-        </w:pBdr>
-      </w:pPr>
-      <w:r>
-        <w:rPr>
-          <w:b/>
-          <w:color w:val="1E3A5F"/>
-          <w:sz w:val="23"/>
-        </w:rPr>
-        <w:t>LINUX / AUTOMATION PRACTICE</w:t>
-      </w:r>
-    </w:p>
-    <w:p>
-      <w:pPr>
-        <w:spacing w:after="60" w:line="252" w:lineRule="auto"/>
-        <w:jc w:val="both"/>
-      </w:pPr>
-      <w:r>
-        <w:rPr>
-          <w:i w:val="0"/>
-          <w:color w:val="2A2A2A"/>
-          <w:sz w:val="17"/>
-        </w:rPr>
-        <w:t>Six self-directed Bash automation projects: zero-downtime deployment with auto-rollback (auto-deploy-pipeline), SSL certificate monitoring and renewal (auto-ssl-manager), log analysis and threat alerting (log-analyzer-alert), CSV-driven user/access lifecycle management (linux-user-access-mgmt), user/group provisioning and sudo policy automation (enterprise-user-mgmt), and multi-team file-sharing permissions with POSIX ACLs (secure-file-sharing). Daily Linux (Ubuntu) user; self-driven learning, not job-critical production work.</w:t>
+        <w:t>Self-hosted personal AI assistant with multi-model routing, voice I/O and persistent memory.</w:t>
       </w:r>
     </w:p>
     <w:p>
@@ -1353,7 +1482,7 @@
           <w:color w:val="2A2A2A"/>
           <w:sz w:val="19"/>
         </w:rPr>
-        <w:t>Self-paced study for code comprehension, not a certificate — starting from The Odin Project's Intermediate HTML and CSS course, then Full Stack Open (University of Helsinki): JavaScript fundamentals, Node.js/Express in depth, testing, and Git workflow, built from assignment briefs rather than a course guide.</w:t>
+        <w:t>Self-paced study for code comprehension, not a certificate: The Odin Project, then Full Stack Open (University of Helsinki) for JavaScript, Node.js/Express depth, testing and Git workflow.</w:t>
       </w:r>
     </w:p>
     <w:p>

</xml_diff>